<commit_message>
Corrección Salto de Linea
</commit_message>
<xml_diff>
--- a/Documentación/TournamentTracker_SimpleLine.docx
+++ b/Documentación/TournamentTracker_SimpleLine.docx
@@ -174,10 +174,7 @@
       </w:r>
       <w:proofErr w:type="spellEnd"/>
       <w:r>
-        <w:t xml:space="preserve">, entendemos que el software debe adaptarse al negocio y no al revés. Construimos soluciones, no genéricos, eliminando funciones </w:t>
-      </w:r>
-      <w:r>
-        <w:t>innecesarias para entregar herramientas precisas, ágiles y confiables.</w:t>
+        <w:t>, entendemos que el software debe adaptarse al negocio y no al revés. Construimos soluciones, no genéricos, eliminando funciones innecesarias para entregar herramientas precisas, ágiles y confiables.</w:t>
       </w:r>
     </w:p>
     <w:p>
@@ -395,17 +392,7 @@
           <w:sz w:val="26"/>
           <w:szCs w:val="26"/>
         </w:rPr>
-        <w:t xml:space="preserve">3.1. </w:t>
-      </w:r>
-      <w:r>
-        <w:rPr>
-          <w:b/>
-          <w:bCs/>
-          <w:color w:val="7C5CE8"/>
-          <w:sz w:val="26"/>
-          <w:szCs w:val="26"/>
-        </w:rPr>
-        <w:t>Gestión Eficiente de Torneos</w:t>
+        <w:t>3.1. Gestión Eficiente de Torneos</w:t>
       </w:r>
     </w:p>
     <w:p>
@@ -460,7 +447,7 @@
           <w:ilvl w:val="0"/>
           <w:numId w:val="2"/>
         </w:numPr>
-        <w:spacing w:before="60" w:after="60"/>
+        <w:spacing w:before="120" w:after="60"/>
       </w:pPr>
       <w:r>
         <w:rPr>
@@ -471,13 +458,8 @@
         <w:t xml:space="preserve">Registro de Participantes: </w:t>
       </w:r>
       <w:r>
-        <w:t>Carga ágil de nombres, apellidos y teléfonos, con una barra de progreso que indica visualmente cuánto falta para completar el cupo.</w:t>
-      </w:r>
-    </w:p>
-    <w:p>
-      <w:pPr>
-        <w:spacing w:before="120"/>
-      </w:pPr>
+        <w:t>Carga ágil de nombres, apellidos y teléfonos</w:t>
+      </w:r>
     </w:p>
     <w:p>
       <w:pPr>
@@ -622,7 +604,24 @@
         <w:t xml:space="preserve">Indicadores Online: </w:t>
       </w:r>
       <w:r>
-        <w:t>Pantalla principal con el estado en vivo de todos los torneos, partidos jugados y campeones coronados.</w:t>
+        <w:t xml:space="preserve">Pantalla principal con el estado en vivo de todos los torneos, partidos jugados y campeones </w:t>
+      </w:r>
+      <w:proofErr w:type="gramStart"/>
+      <w:r>
+        <w:t>coronados</w:t>
+      </w:r>
+      <w:r>
+        <w:t xml:space="preserve"> </w:t>
+      </w:r>
+      <w:r>
+        <w:t>,</w:t>
+      </w:r>
+      <w:proofErr w:type="gramEnd"/>
+      <w:r>
+        <w:t xml:space="preserve"> con una barra de progreso que indica visualmente cuánto falta para completar el </w:t>
+      </w:r>
+      <w:r>
+        <w:t>torneo</w:t>
       </w:r>
     </w:p>
     <w:p>
@@ -643,10 +642,7 @@
         <w:t xml:space="preserve">Gestión de Empates: </w:t>
       </w:r>
       <w:r>
-        <w:t xml:space="preserve">Herramientas para que el organizador defina </w:t>
-      </w:r>
-      <w:r>
-        <w:t>manualmente las posiciones en caso de igualdad de puntos en la fase de zonas.</w:t>
+        <w:t>Herramientas para que el organizador defina manualmente las posiciones en caso de igualdad de puntos en la fase de zonas.</w:t>
       </w:r>
     </w:p>
     <w:p>
@@ -964,17 +960,7 @@
           <w:sz w:val="26"/>
           <w:szCs w:val="26"/>
         </w:rPr>
-        <w:t xml:space="preserve">3.6.  </w:t>
-      </w:r>
-      <w:r>
-        <w:rPr>
-          <w:b/>
-          <w:bCs/>
-          <w:color w:val="7C5CE8"/>
-          <w:sz w:val="26"/>
-          <w:szCs w:val="26"/>
-        </w:rPr>
-        <w:t>Logística Operativa</w:t>
+        <w:t>3.6.  Logística Operativa</w:t>
       </w:r>
     </w:p>
     <w:p>
@@ -995,6 +981,32 @@
       </w:r>
       <w:r>
         <w:t>. Se podrá asociar la cancha a cada partido. Se mantendrá una cola de asignación futura para los partidos aun no iniciados.</w:t>
+      </w:r>
+    </w:p>
+    <w:p>
+      <w:pPr>
+        <w:pStyle w:val="Prrafodelista"/>
+        <w:numPr>
+          <w:ilvl w:val="0"/>
+          <w:numId w:val="2"/>
+        </w:numPr>
+        <w:spacing w:before="60" w:after="60"/>
+      </w:pPr>
+      <w:r>
+        <w:rPr>
+          <w:b/>
+          <w:bCs/>
+        </w:rPr>
+        <w:t>Estado de Canchas</w:t>
+      </w:r>
+      <w:r>
+        <w:t>:</w:t>
+      </w:r>
+      <w:r>
+        <w:t xml:space="preserve"> Se podrá visualizar el estado de cada cancha en cualquier momento</w:t>
+      </w:r>
+      <w:r>
+        <w:t xml:space="preserve"> con colores indicativos de su estado.</w:t>
       </w:r>
     </w:p>
     <w:p>
@@ -1491,14 +1503,7 @@
                 <w:sz w:val="20"/>
                 <w:szCs w:val="20"/>
               </w:rPr>
-              <w:t xml:space="preserve">Entendemos sus procesos y el problema real sin </w:t>
-            </w:r>
-            <w:r>
-              <w:rPr>
-                <w:sz w:val="20"/>
-                <w:szCs w:val="20"/>
-              </w:rPr>
-              <w:t>vender de más.</w:t>
+              <w:t>Entendemos sus procesos y el problema real sin vender de más.</w:t>
             </w:r>
           </w:p>
         </w:tc>
@@ -1702,14 +1707,7 @@
                 <w:sz w:val="20"/>
                 <w:szCs w:val="20"/>
               </w:rPr>
-              <w:t xml:space="preserve">, documentación y capacitación para una </w:t>
-            </w:r>
-            <w:r>
-              <w:rPr>
-                <w:sz w:val="20"/>
-                <w:szCs w:val="20"/>
-              </w:rPr>
-              <w:t>salida al mercado lista.</w:t>
+              <w:t>, documentación y capacitación para una salida al mercado lista.</w:t>
             </w:r>
           </w:p>
         </w:tc>

</xml_diff>